<commit_message>
docs: regenerate field-only deployment DOCX
Co-Authored-By: Claude Fable 5 <noreply@anthropic.com>
</commit_message>
<xml_diff>
--- a/Deployment/DEPLOYMENT-GUIDE.docx
+++ b/Deployment/DEPLOYMENT-GUIDE.docx
@@ -98,64 +98,6 @@
           </w:p>
         </w:tc>
       </w:tr>
-      <w:tr>
-        <w:tc>
-          <w:tcPr>
-            <w:tcW w:type="dxa" w:w="4320"/>
-          </w:tcPr>
-          <w:p>
-            <w:r/>
-            <w:r>
-              <w:t>Monitoring console (office)</w:t>
-            </w:r>
-          </w:p>
-        </w:tc>
-        <w:tc>
-          <w:tcPr>
-            <w:tcW w:type="dxa" w:w="4320"/>
-          </w:tcPr>
-          <w:p>
-            <w:r/>
-            <w:r>
-              <w:rPr>
-                <w:rFonts w:ascii="Consolas" w:hAnsi="Consolas"/>
-                <w:color w:val="4F5CE5"/>
-                <w:sz w:val="20"/>
-              </w:rPr>
-              <w:t>https://districtjangaon.github.io/jangaon-attendance/console/</w:t>
-            </w:r>
-          </w:p>
-        </w:tc>
-      </w:tr>
-      <w:tr>
-        <w:tc>
-          <w:tcPr>
-            <w:tcW w:type="dxa" w:w="4320"/>
-          </w:tcPr>
-          <w:p>
-            <w:r/>
-            <w:r>
-              <w:t>Privacy policy</w:t>
-            </w:r>
-          </w:p>
-        </w:tc>
-        <w:tc>
-          <w:tcPr>
-            <w:tcW w:type="dxa" w:w="4320"/>
-          </w:tcPr>
-          <w:p>
-            <w:r/>
-            <w:r>
-              <w:rPr>
-                <w:rFonts w:ascii="Consolas" w:hAnsi="Consolas"/>
-                <w:color w:val="4F5CE5"/>
-                <w:sz w:val="20"/>
-              </w:rPr>
-              <w:t>https://districtjangaon.github.io/jangaon-attendance/privacy.html</w:t>
-            </w:r>
-          </w:p>
-        </w:tc>
-      </w:tr>
     </w:tbl>
     <w:p/>
     <w:p>
@@ -174,7 +116,7 @@
           <w:color w:val="4F5CE5"/>
           <w:sz w:val="20"/>
         </w:rPr>
-        <w:t>BUILD: v1.9-20260814-1900</w:t>
+        <w:t>BUILD: v2.1-20260815-1130</w:t>
       </w:r>
       <w:r>
         <w:t xml:space="preserve"> (or newer). When reporting a problem, always note this build number.</w:t>
@@ -764,197 +706,7 @@
         <w:pStyle w:val="Heading1"/>
       </w:pPr>
       <w:r>
-        <w:t>Part D — Console operation (district admin team)</w:t>
-      </w:r>
-    </w:p>
-    <w:p>
-      <w:r>
-        <w:t>Open the console address in Chrome on a PC (works on a phone too, in landscape). Sign in with your admin mobile number and PIN.</w:t>
-      </w:r>
-    </w:p>
-    <w:p>
-      <w:pPr>
-        <w:pStyle w:val="ListBullet"/>
-      </w:pPr>
-      <w:r>
-        <w:rPr>
-          <w:b/>
-        </w:rPr>
-        <w:t>Dashboard</w:t>
-      </w:r>
-      <w:r>
-        <w:t xml:space="preserve"> — today's live picture: stat cards, in-time chart, sector top-10, geofence</w:t>
-      </w:r>
-    </w:p>
-    <w:p>
-      <w:r>
-        <w:t xml:space="preserve">  verification, searchable staff table. The banner above the tabs shows </w:t>
-      </w:r>
-      <w:r>
-        <w:rPr>
-          <w:b/>
-        </w:rPr>
-        <w:t>how fresh the data is</w:t>
-      </w:r>
-      <w:r>
-        <w:t xml:space="preserve"> (it regenerates every ~5 minutes on working days; the console never reads the raw sheet directly).</w:t>
-      </w:r>
-    </w:p>
-    <w:p>
-      <w:pPr>
-        <w:pStyle w:val="ListBullet"/>
-      </w:pPr>
-      <w:r>
-        <w:rPr>
-          <w:b/>
-        </w:rPr>
-        <w:t>Analytics</w:t>
-      </w:r>
-      <w:r>
-        <w:t xml:space="preserve"> — pick month + scope → Analyse (district-wide pulls all 27 sector files;</w:t>
-      </w:r>
-    </w:p>
-    <w:p>
-      <w:r>
-        <w:t xml:space="preserve">  allow a few seconds).</w:t>
-      </w:r>
-    </w:p>
-    <w:p>
-      <w:pPr>
-        <w:pStyle w:val="ListBullet"/>
-      </w:pPr>
-      <w:r>
-        <w:rPr>
-          <w:b/>
-        </w:rPr>
-        <w:t>Flagged</w:t>
-      </w:r>
-      <w:r>
-        <w:t xml:space="preserve"> — informational list: outside-geofence, GPS-unverified, fake-GPS suspects.</w:t>
-      </w:r>
-    </w:p>
-    <w:p>
-      <w:r>
-        <w:t xml:space="preserve">  Attendance is auto-approved; nothing here blocks anyone's record.</w:t>
-      </w:r>
-    </w:p>
-    <w:p>
-      <w:pPr>
-        <w:pStyle w:val="ListBullet"/>
-      </w:pPr>
-      <w:r>
-        <w:rPr>
-          <w:b/>
-        </w:rPr>
-        <w:t>Monthly</w:t>
-      </w:r>
-      <w:r>
-        <w:t xml:space="preserve"> — per-sector day-by-day grid; coloured cells, export CSV.</w:t>
-      </w:r>
-    </w:p>
-    <w:p>
-      <w:pPr>
-        <w:pStyle w:val="ListBullet"/>
-      </w:pPr>
-      <w:r>
-        <w:rPr>
-          <w:b/>
-        </w:rPr>
-        <w:t>Reports</w:t>
-      </w:r>
-      <w:r>
-        <w:t xml:space="preserve"> — month × scope registers; working days exclude Sundays and state holidays.</w:t>
-      </w:r>
-    </w:p>
-    <w:p>
-      <w:pPr>
-        <w:pStyle w:val="ListBullet"/>
-      </w:pPr>
-      <w:r>
-        <w:rPr>
-          <w:b/>
-        </w:rPr>
-        <w:t>Leaves</w:t>
-      </w:r>
-      <w:r>
-        <w:t xml:space="preserve"> — applications from the field app; rejecting one returns those days to</w:t>
-      </w:r>
-    </w:p>
-    <w:p>
-      <w:r>
-        <w:t xml:space="preserve">  "not marked".</w:t>
-      </w:r>
-    </w:p>
-    <w:p>
-      <w:pPr>
-        <w:pStyle w:val="ListBullet"/>
-      </w:pPr>
-      <w:r>
-        <w:rPr>
-          <w:b/>
-        </w:rPr>
-        <w:t>Users &amp; Admin</w:t>
-      </w:r>
-      <w:r>
-        <w:t xml:space="preserve"> — search users; fix an AWC's geofence by standing at the centre and</w:t>
-      </w:r>
-    </w:p>
-    <w:p>
-      <w:r>
-        <w:t xml:space="preserve">  capturing GPS.</w:t>
-      </w:r>
-    </w:p>
-    <w:p>
-      <w:pPr>
-        <w:pStyle w:val="ListBullet"/>
-      </w:pPr>
-      <w:r>
-        <w:rPr>
-          <w:b/>
-        </w:rPr>
-        <w:t>🌙 button</w:t>
-      </w:r>
-      <w:r>
-        <w:t xml:space="preserve"> — dark mode for projector reviews.</w:t>
-      </w:r>
-    </w:p>
-    <w:p>
-      <w:r>
-        <w:rPr>
-          <w:b/>
-        </w:rPr>
-        <w:t>After any backend change</w:t>
-      </w:r>
-      <w:r>
-        <w:t xml:space="preserve"> (done by the technical admin): re-paste </w:t>
-      </w:r>
-      <w:r>
-        <w:rPr>
-          <w:rFonts w:ascii="Consolas" w:hAnsi="Consolas"/>
-          <w:color w:val="4F5CE5"/>
-          <w:sz w:val="20"/>
-        </w:rPr>
-        <w:t>COMBINED.gs</w:t>
-      </w:r>
-      <w:r>
-        <w:t xml:space="preserve"> in the Apps Script editor and deploy a </w:t>
-      </w:r>
-      <w:r>
-        <w:rPr>
-          <w:b/>
-        </w:rPr>
-        <w:t>New version</w:t>
-      </w:r>
-      <w:r>
-        <w:t xml:space="preserve"> — the web app URL stays the same.</w:t>
-      </w:r>
-    </w:p>
-    <w:p>
-      <w:pPr>
-        <w:pStyle w:val="Heading1"/>
-      </w:pPr>
-      <w:r>
-        <w:t>Part E — How updates reach phones</w:t>
+        <w:t>Part D — How updates reach phones</w:t>
       </w:r>
     </w:p>
     <w:p>
@@ -1034,7 +786,7 @@
         <w:pStyle w:val="Heading1"/>
       </w:pPr>
       <w:r>
-        <w:t>Part F — Troubleshooting</w:t>
+        <w:t>Part E — Troubleshooting</w:t>
       </w:r>
     </w:p>
     <w:tbl>
@@ -1562,7 +1314,7 @@
           <w:p>
             <w:r/>
             <w:r>
-              <w:t>Marked but console doesn't show it</w:t>
+              <w:t>Marked, but the district office says it has not received it</w:t>
             </w:r>
           </w:p>
         </w:tc>
@@ -1573,7 +1325,7 @@
           <w:p>
             <w:r/>
             <w:r>
-              <w:t>Check the phone's Pending count (must be 0), then check the console banner's data age — the summary refreshes about every 5 minutes. Wait one refresh and press Refresh in the console.</w:t>
+              <w:t>Check the phone's Pending count on the home screen (must be 0). Office records refresh about every 5 minutes — ask them to check again after that.</w:t>
             </w:r>
           </w:p>
         </w:tc>
@@ -1597,7 +1349,7 @@
           <w:p>
             <w:r/>
             <w:r>
-              <w:t>Console shows "delayed/stale data" banner</w:t>
+              <w:t>Every mark at a centre shows "outside geofence"</w:t>
             </w:r>
           </w:p>
         </w:tc>
@@ -1608,7 +1360,7 @@
           <w:p>
             <w:r/>
             <w:r>
-              <w:t>If it says the system is live but nothing new — that is normal on quiet hours. If it says delayed: the technical admin checks the Apps Script triggers (RUNBOOK).</w:t>
+              <w:t>The centre's stored location is wrong or missing. Inform the district office — they can re-capture the centre's correct location; marks are never blocked meanwhile.</w:t>
             </w:r>
           </w:p>
         </w:tc>
@@ -1622,41 +1374,6 @@
             <w:r/>
             <w:r>
               <w:t>14</w:t>
-            </w:r>
-          </w:p>
-        </w:tc>
-        <w:tc>
-          <w:tcPr>
-            <w:tcW w:type="dxa" w:w="2880"/>
-          </w:tcPr>
-          <w:p>
-            <w:r/>
-            <w:r>
-              <w:t>Wrong AWC location causing "outside geofence" flags for everyone at a centre</w:t>
-            </w:r>
-          </w:p>
-        </w:tc>
-        <w:tc>
-          <w:tcPr>
-            <w:tcW w:type="dxa" w:w="2880"/>
-          </w:tcPr>
-          <w:p>
-            <w:r/>
-            <w:r>
-              <w:t>Admin: console → Users &amp; Admin → "Fix an AWC's geofence" → stand at the centre → capture.</w:t>
-            </w:r>
-          </w:p>
-        </w:tc>
-      </w:tr>
-      <w:tr>
-        <w:tc>
-          <w:tcPr>
-            <w:tcW w:type="dxa" w:w="2880"/>
-          </w:tcPr>
-          <w:p>
-            <w:r/>
-            <w:r>
-              <w:t>15</w:t>
             </w:r>
           </w:p>
         </w:tc>
@@ -1701,7 +1418,7 @@
         <w:pStyle w:val="Heading1"/>
       </w:pPr>
       <w:r>
-        <w:t>Part G — Play Store track (running in parallel)</w:t>
+        <w:t>Part F — Play Store track (running in parallel)</w:t>
       </w:r>
     </w:p>
     <w:p>

</xml_diff>

<commit_message>
docs: regenerate QR-only deployment DOCX
Co-Authored-By: Claude Fable 5 <noreply@anthropic.com>
</commit_message>
<xml_diff>
--- a/Deployment/DEPLOYMENT-GUIDE.docx
+++ b/Deployment/DEPLOYMENT-GUIDE.docx
@@ -21,85 +21,31 @@
         <w:t xml:space="preserve"> This guide covers the web (PWA) channel, which is live today and runs in parallel with the Google Play rollout. Phones installed this way get every update automatically — nothing needs to be reinstalled when the Play Store version arrives later.</w:t>
       </w:r>
     </w:p>
-    <w:tbl>
-      <w:tblPr>
-        <w:tblStyle w:val="LightGrid-Accent1"/>
-        <w:tblW w:type="auto" w:w="0"/>
-        <w:tblLook w:firstColumn="1" w:firstRow="1" w:lastColumn="0" w:lastRow="0" w:noHBand="0" w:noVBand="1" w:val="04A0"/>
-      </w:tblPr>
-      <w:tblGrid>
-        <w:gridCol w:w="4320"/>
-        <w:gridCol w:w="4320"/>
-      </w:tblGrid>
-      <w:tr>
-        <w:tc>
-          <w:tcPr>
-            <w:tcW w:type="dxa" w:w="4320"/>
-          </w:tcPr>
-          <w:p>
-            <w:r>
-              <w:rPr>
-                <w:b/>
-              </w:rPr>
-            </w:r>
-            <w:r>
-              <w:rPr>
-                <w:b/>
-              </w:rPr>
-              <w:t>What</w:t>
-            </w:r>
-          </w:p>
-        </w:tc>
-        <w:tc>
-          <w:tcPr>
-            <w:tcW w:type="dxa" w:w="4320"/>
-          </w:tcPr>
-          <w:p>
-            <w:r>
-              <w:rPr>
-                <w:b/>
-              </w:rPr>
-            </w:r>
-            <w:r>
-              <w:rPr>
-                <w:b/>
-              </w:rPr>
-              <w:t>Address</w:t>
-            </w:r>
-          </w:p>
-        </w:tc>
-      </w:tr>
-      <w:tr>
-        <w:tc>
-          <w:tcPr>
-            <w:tcW w:type="dxa" w:w="4320"/>
-          </w:tcPr>
-          <w:p>
-            <w:r/>
-            <w:r>
-              <w:t>Field app (phones)</w:t>
-            </w:r>
-          </w:p>
-        </w:tc>
-        <w:tc>
-          <w:tcPr>
-            <w:tcW w:type="dxa" w:w="4320"/>
-          </w:tcPr>
-          <w:p>
-            <w:r/>
-            <w:r>
-              <w:rPr>
-                <w:rFonts w:ascii="Consolas" w:hAnsi="Consolas"/>
-                <w:color w:val="4F5CE5"/>
-                <w:sz w:val="20"/>
-              </w:rPr>
-              <w:t>https://districtjangaon.github.io/jangaon-attendance/app/</w:t>
-            </w:r>
-          </w:p>
-        </w:tc>
-      </w:tr>
-    </w:tbl>
-    <w:p/>
+    <w:p>
+      <w:r>
+        <w:t xml:space="preserve">Installation is by </w:t>
+      </w:r>
+      <w:r>
+        <w:rPr>
+          <w:b/>
+        </w:rPr>
+        <w:t>QR code only</w:t>
+      </w:r>
+      <w:r>
+        <w:t xml:space="preserve"> — every sector receives the official printed QR poster (</w:t>
+      </w:r>
+      <w:r>
+        <w:rPr>
+          <w:rFonts w:ascii="Consolas" w:hAnsi="Consolas"/>
+          <w:color w:val="4F5CE5"/>
+          <w:sz w:val="20"/>
+        </w:rPr>
+        <w:t>INSTALL-POSTER.png</w:t>
+      </w:r>
+      <w:r>
+        <w:t xml:space="preserve"> in this folder). No address is typed and no link is shared on WhatsApp: the poster's QR is the single official entry point.</w:t>
+      </w:r>
+    </w:p>
     <w:p>
       <w:r>
         <w:rPr>
@@ -116,10 +62,10 @@
           <w:color w:val="4F5CE5"/>
           <w:sz w:val="20"/>
         </w:rPr>
-        <w:t>BUILD: v2.1-20260815-1130</w:t>
+        <w:t>BUILD: v4.2</w:t>
       </w:r>
       <w:r>
-        <w:t xml:space="preserve"> (or newer). When reporting a problem, always note this build number.</w:t>
+        <w:t xml:space="preserve"> (or newer) with a date. When reporting a problem, always note this build number.</w:t>
       </w:r>
     </w:p>
     <w:p>
@@ -149,7 +95,19 @@
         <w:pStyle w:val="ListNumber"/>
       </w:pPr>
       <w:r>
-        <w:t xml:space="preserve">Open </w:t>
+        <w:t xml:space="preserve">Point the phone </w:t>
+      </w:r>
+      <w:r>
+        <w:rPr>
+          <w:b/>
+        </w:rPr>
+        <w:t>camera</w:t>
+      </w:r>
+      <w:r>
+        <w:t xml:space="preserve"> at the official QR poster and tap the link that pops up</w:t>
+      </w:r>
+      <w:r>
+        <w:t xml:space="preserve"> (choose </w:t>
       </w:r>
       <w:r>
         <w:rPr>
@@ -158,7 +116,7 @@
         <w:t>Chrome</w:t>
       </w:r>
       <w:r>
-        <w:t xml:space="preserve"> on the phone (the round red/yellow/green/blue icon).</w:t>
+        <w:t xml:space="preserve"> if asked).</w:t>
       </w:r>
     </w:p>
     <w:p>
@@ -166,21 +124,7 @@
         <w:pStyle w:val="ListNumber"/>
       </w:pPr>
       <w:r>
-        <w:t>Type the app address into the top bar:</w:t>
-      </w:r>
-      <w:r>
-        <w:t xml:space="preserve"> </w:t>
-      </w:r>
-      <w:r>
-        <w:rPr>
-          <w:rFonts w:ascii="Consolas" w:hAnsi="Consolas"/>
-          <w:color w:val="4F5CE5"/>
-          <w:sz w:val="20"/>
-        </w:rPr>
-        <w:t>districtjangaon.github.io/jangaon-attendance/app/</w:t>
-      </w:r>
-      <w:r>
-        <w:t xml:space="preserve"> and press Go.</w:t>
+        <w:t>Wait for the login screen to appear (emblem on top, "Sisu Mahila Samridhi").</w:t>
       </w:r>
     </w:p>
     <w:p>
@@ -188,7 +132,40 @@
         <w:pStyle w:val="ListNumber"/>
       </w:pPr>
       <w:r>
-        <w:t>Wait for the login screen to appear fully (navy header with the Telangana emblem).</w:t>
+        <w:t xml:space="preserve">A green </w:t>
+      </w:r>
+      <w:r>
+        <w:rPr>
+          <w:b/>
+        </w:rPr>
+        <w:t>"⬇ Install this app on the phone"</w:t>
+      </w:r>
+      <w:r>
+        <w:t xml:space="preserve"> button appears at the top —</w:t>
+      </w:r>
+      <w:r>
+        <w:t xml:space="preserve"> tap it, then tap </w:t>
+      </w:r>
+      <w:r>
+        <w:rPr>
+          <w:b/>
+        </w:rPr>
+        <w:t>Install</w:t>
+      </w:r>
+      <w:r>
+        <w:t xml:space="preserve"> on the confirmation. Done: the </w:t>
+      </w:r>
+      <w:r>
+        <w:rPr>
+          <w:b/>
+        </w:rPr>
+        <w:t>Samridhi</w:t>
+      </w:r>
+      <w:r>
+        <w:t xml:space="preserve"> icon</w:t>
+      </w:r>
+      <w:r>
+        <w:t xml:space="preserve"> appears on the home screen.</w:t>
       </w:r>
     </w:p>
     <w:p>
@@ -196,7 +173,7 @@
         <w:pStyle w:val="ListNumber"/>
       </w:pPr>
       <w:r>
-        <w:t xml:space="preserve">Tap the </w:t>
+        <w:t xml:space="preserve">If the green button does not appear on an older phone: tap Chrome's </w:t>
       </w:r>
       <w:r>
         <w:rPr>
@@ -205,15 +182,10 @@
         <w:t>⋮</w:t>
       </w:r>
       <w:r>
-        <w:t xml:space="preserve"> (three dots) at the top-right of Chrome.</w:t>
+        <w:t xml:space="preserve"> menu</w:t>
       </w:r>
-    </w:p>
-    <w:p>
-      <w:pPr>
-        <w:pStyle w:val="ListNumber"/>
-      </w:pPr>
       <w:r>
-        <w:t xml:space="preserve">Tap </w:t>
+        <w:t xml:space="preserve"> (top-right) → </w:t>
       </w:r>
       <w:r>
         <w:rPr>
@@ -222,45 +194,7 @@
         <w:t>"Add to Home screen"</w:t>
       </w:r>
       <w:r>
-        <w:t xml:space="preserve"> (on some phones: </w:t>
-      </w:r>
-      <w:r>
-        <w:rPr>
-          <w:b/>
-        </w:rPr>
-        <w:t>"Install app"</w:t>
-      </w:r>
-      <w:r>
-        <w:t>).</w:t>
-      </w:r>
-    </w:p>
-    <w:p>
-      <w:pPr>
-        <w:pStyle w:val="ListNumber"/>
-      </w:pPr>
-      <w:r>
-        <w:t xml:space="preserve">Tap </w:t>
-      </w:r>
-      <w:r>
-        <w:rPr>
-          <w:b/>
-        </w:rPr>
-        <w:t>Install / Add</w:t>
-      </w:r>
-      <w:r>
-        <w:t xml:space="preserve">. The </w:t>
-      </w:r>
-      <w:r>
-        <w:rPr>
-          <w:b/>
-        </w:rPr>
-        <w:t>Samridhi</w:t>
-      </w:r>
-      <w:r>
-        <w:t xml:space="preserve"> icon (green emblem on dark blue) appears on the</w:t>
-      </w:r>
-      <w:r>
-        <w:t xml:space="preserve"> home screen.</w:t>
+        <w:t xml:space="preserve"> → Install.</w:t>
       </w:r>
     </w:p>
     <w:p>
@@ -274,7 +208,7 @@
         <w:rPr>
           <w:b/>
         </w:rPr>
-        <w:t>from that icon</w:t>
+        <w:t>from the icon</w:t>
       </w:r>
       <w:r>
         <w:t>, not from Chrome.</w:t>
@@ -291,10 +225,18 @@
         <w:rPr>
           <w:b/>
         </w:rPr>
-        <w:t>Never install from any other link.</w:t>
+        <w:t>Install only by scanning the official QR poster.</w:t>
       </w:r>
       <w:r>
-        <w:t xml:space="preserve"> Only the address above is the official app.</w:t>
+        <w:t xml:space="preserve"> Never from a forwarded</w:t>
+      </w:r>
+    </w:p>
+    <w:p>
+      <w:pPr>
+        <w:pStyle w:val="IntenseQuote"/>
+      </w:pPr>
+      <w:r>
+        <w:t>link or message.</w:t>
       </w:r>
     </w:p>
     <w:p>

</xml_diff>

<commit_message>
docs: regenerate user-facing deployment DOCX
Co-Authored-By: Claude Fable 5 <noreply@anthropic.com>
</commit_message>
<xml_diff>
--- a/Deployment/DEPLOYMENT-GUIDE.docx
+++ b/Deployment/DEPLOYMENT-GUIDE.docx
@@ -18,7 +18,7 @@
         <w:t>WD&amp;CW Jangaon · Government of Telangana</w:t>
       </w:r>
       <w:r>
-        <w:t xml:space="preserve"> This guide covers the web (PWA) channel, which is live today and runs in parallel with the Google Play rollout. Phones installed this way get every update automatically — nothing needs to be reinstalled when the Play Store version arrives later.</w:t>
+        <w:t xml:space="preserve"> This guide explains how to install, use and troubleshoot the Sisu Mahila Samridhi app. Installed phones receive every update automatically — nothing ever needs reinstalling.</w:t>
       </w:r>
     </w:p>
     <w:p>
@@ -703,28 +703,6 @@
     </w:p>
     <w:p>
       <w:pPr>
-        <w:pStyle w:val="ListBullet"/>
-      </w:pPr>
-      <w:r>
-        <w:t xml:space="preserve">The </w:t>
-      </w:r>
-      <w:r>
-        <w:rPr>
-          <w:b/>
-        </w:rPr>
-        <w:t>Play Store version</w:t>
-      </w:r>
-      <w:r>
-        <w:t>, once installed, updates its shell through Play — but the</w:t>
-      </w:r>
-    </w:p>
-    <w:p>
-      <w:r>
-        <w:t xml:space="preserve">  screens inside come from the web and stay current automatically.</w:t>
-      </w:r>
-    </w:p>
-    <w:p>
-      <w:pPr>
         <w:pStyle w:val="Heading1"/>
       </w:pPr>
       <w:r>
@@ -1355,30 +1333,6 @@
         <w:t xml:space="preserve"> worker → Anganwadi supervisor / sector → district office (district.jana@gmail.com) with: worker name, AWC, phone model, BUILD number, and a screenshot of the problem.</w:t>
       </w:r>
     </w:p>
-    <w:p>
-      <w:pPr>
-        <w:pStyle w:val="Heading1"/>
-      </w:pPr>
-      <w:r>
-        <w:t>Part F — Play Store track (running in parallel)</w:t>
-      </w:r>
-    </w:p>
-    <w:p>
-      <w:r>
-        <w:t xml:space="preserve">The Play Store version is the same app in an official wrapper. Until it is public, phones use Part A. Once published, new phones install from Play instead — both kinds of installation work side by side and show identical data. Testers for the Play closed test are onboarded via the </w:t>
-      </w:r>
-      <w:r>
-        <w:rPr>
-          <w:rFonts w:ascii="Consolas" w:hAnsi="Consolas"/>
-          <w:color w:val="4F5CE5"/>
-          <w:sz w:val="20"/>
-        </w:rPr>
-        <w:t>request/</w:t>
-      </w:r>
-      <w:r>
-        <w:t xml:space="preserve"> folder's tester sheet.</w:t>
-      </w:r>
-    </w:p>
     <w:sectPr>
       <w:pgSz w:w="12240" w:h="15840"/>
       <w:pgMar w:top="1440" w:right="1152" w:bottom="1440" w:left="1152" w:header="720" w:footer="720" w:gutter="0"/>

</xml_diff>

<commit_message>
docs: deployment guide PDF with embedded QR; escalation via EDM
Guide now ships as PDF (3 pages, QR embedded under the install intro, also
embedded in the DOCX); escalation contact changed from email to the EDM
(e-District Manager) at the district office. BOQ regenerated as sections
A/B/C only (payment schedule and acceptance block removed) in xlsx/docx/pdf
— all BOQ formats stay gitignored.

Co-Authored-By: Claude Fable 5 <noreply@anthropic.com>
</commit_message>
<xml_diff>
--- a/Deployment/DEPLOYMENT-GUIDE.docx
+++ b/Deployment/DEPLOYMENT-GUIDE.docx
@@ -44,6 +44,45 @@
       </w:r>
       <w:r>
         <w:t xml:space="preserve"> in this folder). No address is typed and no link is shared on WhatsApp: the poster's QR is the single official entry point.</w:t>
+      </w:r>
+    </w:p>
+    <w:p>
+      <w:pPr>
+        <w:jc w:val="center"/>
+      </w:pPr>
+      <w:r>
+        <w:drawing>
+          <wp:inline xmlns:a="http://schemas.openxmlformats.org/drawingml/2006/main" xmlns:pic="http://schemas.openxmlformats.org/drawingml/2006/picture">
+            <wp:extent cx="2103120" cy="2103120"/>
+            <wp:docPr id="1" name="Picture 1"/>
+            <wp:cNvGraphicFramePr>
+              <a:graphicFrameLocks noChangeAspect="1"/>
+            </wp:cNvGraphicFramePr>
+            <a:graphic>
+              <a:graphicData uri="http://schemas.openxmlformats.org/drawingml/2006/picture">
+                <pic:pic>
+                  <pic:nvPicPr>
+                    <pic:cNvPr id="0" name="install-qr.png"/>
+                    <pic:cNvPicPr/>
+                  </pic:nvPicPr>
+                  <pic:blipFill>
+                    <a:blip r:embed="rId9"/>
+                    <a:stretch>
+                      <a:fillRect/>
+                    </a:stretch>
+                  </pic:blipFill>
+                  <pic:spPr>
+                    <a:xfrm>
+                      <a:off x="0" y="0"/>
+                      <a:ext cx="2103120" cy="2103120"/>
+                    </a:xfrm>
+                    <a:prstGeom prst="rect"/>
+                  </pic:spPr>
+                </pic:pic>
+              </a:graphicData>
+            </a:graphic>
+          </wp:inline>
+        </w:drawing>
       </w:r>
     </w:p>
     <w:p>
@@ -1330,7 +1369,16 @@
         <w:t>Escalation path:</w:t>
       </w:r>
       <w:r>
-        <w:t xml:space="preserve"> worker → Anganwadi supervisor / sector → district office (district.jana@gmail.com) with: worker name, AWC, phone model, BUILD number, and a screenshot of the problem.</w:t>
+        <w:t xml:space="preserve"> worker → Anganwadi supervisor / sector → </w:t>
+      </w:r>
+      <w:r>
+        <w:rPr>
+          <w:b/>
+        </w:rPr>
+        <w:t>connect with the EDM (e-District Manager) at the district office</w:t>
+      </w:r>
+      <w:r>
+        <w:t>, sharing: worker name, AWC, phone model, BUILD number, and a screenshot of the problem.</w:t>
       </w:r>
     </w:p>
     <w:sectPr>

</xml_diff>